<commit_message>
Most Functional Requirements done
</commit_message>
<xml_diff>
--- a/docs/requerimientos_funcionales/obligatorios/rf_09/plantilla_rf09.docx
+++ b/docs/requerimientos_funcionales/obligatorios/rf_09/plantilla_rf09.docx
@@ -2121,8 +2121,6 @@
           <w:lang w:val="es-AR"/>
         </w:rPr>
       </w:pPr>
-      <w:proofErr w:type="spellStart"/>
-      <w:proofErr w:type="gramStart"/>
       <w:r>
         <w:rPr>
           <w:bCs/>
@@ -2132,25 +2130,14 @@
         </w:rPr>
         <w:t>RegistrarInformaciónSanitaria</w:t>
       </w:r>
-      <w:proofErr w:type="spellEnd"/>
-      <w:r>
-        <w:rPr>
-          <w:bCs/>
-          <w:sz w:val="20"/>
-          <w:szCs w:val="20"/>
-          <w:lang w:val="es-AR"/>
-        </w:rPr>
-        <w:t>(</w:t>
-      </w:r>
-      <w:proofErr w:type="gramEnd"/>
-      <w:r>
-        <w:rPr>
-          <w:bCs/>
-          <w:sz w:val="20"/>
-          <w:szCs w:val="20"/>
-          <w:lang w:val="es-AR"/>
-        </w:rPr>
-        <w:t>)</w:t>
+      <w:r>
+        <w:rPr>
+          <w:bCs/>
+          <w:sz w:val="20"/>
+          <w:szCs w:val="20"/>
+          <w:lang w:val="es-AR"/>
+        </w:rPr>
+        <w:t>()</w:t>
       </w:r>
     </w:p>
     <w:p>
@@ -2840,21 +2827,7 @@
           <w:sz w:val="20"/>
           <w:szCs w:val="20"/>
         </w:rPr>
-        <w:t xml:space="preserve">Registra </w:t>
-      </w:r>
-      <w:r>
-        <w:rPr>
-          <w:sz w:val="20"/>
-          <w:szCs w:val="20"/>
-        </w:rPr>
-        <w:t xml:space="preserve">la Información Sanitaria de </w:t>
-      </w:r>
-      <w:r>
-        <w:rPr>
-          <w:sz w:val="20"/>
-          <w:szCs w:val="20"/>
-        </w:rPr>
-        <w:t>una Mascota, y la asocia a la misma.</w:t>
+        <w:t>Gestionar la Información Sanitaria de las Mascotas.</w:t>
       </w:r>
     </w:p>
     <w:p>
@@ -2969,8 +2942,6 @@
               </w:rPr>
               <w:t xml:space="preserve"> </w:t>
             </w:r>
-            <w:proofErr w:type="spellStart"/>
-            <w:proofErr w:type="gramStart"/>
             <w:r>
               <w:rPr>
                 <w:sz w:val="20"/>
@@ -2978,21 +2949,12 @@
               </w:rPr>
               <w:t>RegistrarInformaciónSanitaria</w:t>
             </w:r>
-            <w:proofErr w:type="spellEnd"/>
-            <w:r>
-              <w:rPr>
-                <w:sz w:val="20"/>
-                <w:szCs w:val="20"/>
-              </w:rPr>
-              <w:t>(</w:t>
-            </w:r>
-            <w:proofErr w:type="gramEnd"/>
-            <w:r>
-              <w:rPr>
-                <w:sz w:val="20"/>
-                <w:szCs w:val="20"/>
-              </w:rPr>
-              <w:t>)</w:t>
+            <w:r>
+              <w:rPr>
+                <w:sz w:val="20"/>
+                <w:szCs w:val="20"/>
+              </w:rPr>
+              <w:t>()</w:t>
             </w:r>
           </w:p>
         </w:tc>
@@ -4630,16 +4592,8 @@
             <w:rPr>
               <w:lang w:val="en-US"/>
             </w:rPr>
-            <w:t xml:space="preserve">Lic. Mariela </w:t>
+            <w:t>Lic. Mariela Pastarini</w:t>
           </w:r>
-          <w:proofErr w:type="spellStart"/>
-          <w:r>
-            <w:rPr>
-              <w:lang w:val="en-US"/>
-            </w:rPr>
-            <w:t>Pastarini</w:t>
-          </w:r>
-          <w:proofErr w:type="spellEnd"/>
         </w:p>
       </w:tc>
       <w:tc>

</xml_diff>